<commit_message>
feat: compte démo samuel@test.io + suppression du bouton SSO (login)
- LoginView : texte de démo mis à jour et retrait du bouton SSO (Google seul, pleine largeur)
- seed : ajout de l'utilisateur samuel@test.io / password123 (RH, TechCorp)
- docs : identifiant démo actualisé (README, compte-rendu 08/07, générateurs)
- ajout du script + compte-rendu du 09/07 (guides .docx/.xlsx régénérés)

Co-Authored-By: Claude Opus 4.8 <noreply@anthropic.com>
</commit_message>
<xml_diff>
--- a/Guide-Deploiement-Gratuit-Render-Neon.docx
+++ b/Guide-Deploiement-Gratuit-Render-Neon.docx
@@ -24,7 +24,7 @@
         <w:t xml:space="preserve">votre application sur Internet, sans frais. Render héberge le serveur (Node), Neon fournit la base PostgreSQL. Les deux se connectent à votre dépôt GitHub. Généré le </w:t>
       </w:r>
       <w:r>
-        <w:t xml:space="preserve">08/07/2026</w:t>
+        <w:t xml:space="preserve">09/07/2026</w:t>
       </w:r>
     </w:p>
     <w:p>
@@ -583,7 +583,7 @@
           <w:rFonts w:ascii="Consolas" w:hAnsi="Consolas"/>
           <w:shd w:val="clear" w:fill="EEF2F7"/>
         </w:rPr>
-        <w:t xml:space="preserve">Email : sarah.j@techcorp.io</w:t>
+        <w:t xml:space="preserve">Email : samuel@test.io</w:t>
       </w:r>
     </w:p>
     <w:p>

</xml_diff>